<commit_message>
docx modify file change
</commit_message>
<xml_diff>
--- a/output.docx
+++ b/output.docx
@@ -722,7 +722,7 @@
           <w:sz w:val="25"/>
           <w:szCs w:val="25"/>
         </w:rPr>
-        <w:t>GSC CONTACTS INTERNATIONAL</w:t>
+        <w:t>FAULKNER HANSON PLC</w:t>
       </w:r>
       <w:r>
         <w:rPr>
@@ -754,7 +754,7 @@
           <w:color w:val="212529"/>
           <w:shd w:val="clear" w:color="auto" w:fill="FFFFFF"/>
         </w:rPr>
-        <w:t xml:space="preserve">Gulshan - 1 ,dhaka - 1212 </w:t>
+        <w:t xml:space="preserve">Newman And Peters Trading </w:t>
       </w:r>
       <w:r>
         <w:rPr>
@@ -781,7 +781,7 @@
           <w:sz w:val="25"/>
           <w:szCs w:val="25"/>
         </w:rPr>
-        <w:t>BANGLADESH</w:t>
+        <w:t>FLORENCE TRUJILLO</w:t>
       </w:r>
       <w:r>
         <w:rPr>
@@ -1160,7 +1160,7 @@
           <w:sz w:val="25"/>
           <w:szCs w:val="25"/>
         </w:rPr>
-        <w:t xml:space="preserve">BANGLADESH </w:t>
+        <w:t xml:space="preserve">FLORENCE TRUJILLO </w:t>
       </w:r>
       <w:r>
         <w:rPr>
@@ -1354,7 +1354,7 @@
           <w:szCs w:val="25"/>
           <w:lang w:val="en-US"/>
         </w:rPr>
-        <w:t>04 March 2025</w:t>
+        <w:t>05 March 2025</w:t>
       </w:r>
       <w:r>
         <w:rPr>
@@ -1383,7 +1383,7 @@
           <w:szCs w:val="25"/>
           <w:lang w:val="en-US"/>
         </w:rPr>
-        <w:t>04 March 2027 </w:t>
+        <w:t>05 March 2027 </w:t>
       </w:r>
       <w:r>
         <w:rPr>
@@ -3752,7 +3752,7 @@
           <w:sz w:val="25"/>
           <w:szCs w:val="25"/>
         </w:rPr>
-        <w:t>BANGLADESH</w:t>
+        <w:t>FLORENCE TRUJILLO</w:t>
       </w:r>
       <w:r>
         <w:rPr>
@@ -8711,7 +8711,7 @@
           <w:szCs w:val="25"/>
           <w:lang w:val="en-US"/>
         </w:rPr>
-        <w:t>04 March 2025</w:t>
+        <w:t>05 March 2025</w:t>
       </w:r>
     </w:p>
     <w:p>
@@ -8836,7 +8836,7 @@
           <w:sz w:val="24"/>
           <w:szCs w:val="24"/>
         </w:rPr>
-        <w:t>GSC CONTACTS INTERNATIONAL ,</w:t>
+        <w:t>FAULKNER HANSON PLC ,</w:t>
       </w:r>
       <w:r>
         <w:rPr>
@@ -8854,7 +8854,7 @@
           <w:sz w:val="24"/>
           <w:szCs w:val="24"/>
         </w:rPr>
-        <w:t>BANGLADESH</w:t>
+        <w:t>FLORENCE TRUJILLO</w:t>
       </w:r>
       <w:r>
         <w:rPr>
@@ -8927,7 +8927,7 @@
           <w:szCs w:val="25"/>
           <w:lang w:val="en-US"/>
         </w:rPr>
-        <w:t>BILASH KUMAR MONDOL</w:t>
+        <w:t>MARVIN BRIGHT</w:t>
       </w:r>
     </w:p>
     <w:p>
@@ -8967,7 +8967,7 @@
           <w:szCs w:val="25"/>
           <w:lang w:val="en-US"/>
         </w:rPr>
-        <w:t>WEB DEVELOPER</w:t>
+        <w:t>AD COMMODO EU QUIA D</w:t>
       </w:r>
     </w:p>
     <w:p>

</xml_diff>

<commit_message>
docx file modify page modify
</commit_message>
<xml_diff>
--- a/output.docx
+++ b/output.docx
@@ -722,7 +722,7 @@
           <w:sz w:val="25"/>
           <w:szCs w:val="25"/>
         </w:rPr>
-        <w:t>FAULKNER HANSON PLC</w:t>
+        <w:t>MIDDLETON SANDOVAL PLC</w:t>
       </w:r>
       <w:r>
         <w:rPr>
@@ -754,7 +754,7 @@
           <w:color w:val="212529"/>
           <w:shd w:val="clear" w:color="auto" w:fill="FFFFFF"/>
         </w:rPr>
-        <w:t xml:space="preserve">Newman And Peters Trading </w:t>
+        <w:t xml:space="preserve">Greer And Kelley Trading </w:t>
       </w:r>
       <w:r>
         <w:rPr>
@@ -781,7 +781,7 @@
           <w:sz w:val="25"/>
           <w:szCs w:val="25"/>
         </w:rPr>
-        <w:t>FLORENCE TRUJILLO</w:t>
+        <w:t>MELISSA PIERCE</w:t>
       </w:r>
       <w:r>
         <w:rPr>
@@ -1160,7 +1160,7 @@
           <w:sz w:val="25"/>
           <w:szCs w:val="25"/>
         </w:rPr>
-        <w:t xml:space="preserve">FLORENCE TRUJILLO </w:t>
+        <w:t xml:space="preserve">MELISSA PIERCE </w:t>
       </w:r>
       <w:r>
         <w:rPr>
@@ -1354,7 +1354,7 @@
           <w:szCs w:val="25"/>
           <w:lang w:val="en-US"/>
         </w:rPr>
-        <w:t>05 March 2025</w:t>
+        <w:t>15 March 2025</w:t>
       </w:r>
       <w:r>
         <w:rPr>
@@ -1383,7 +1383,7 @@
           <w:szCs w:val="25"/>
           <w:lang w:val="en-US"/>
         </w:rPr>
-        <w:t>05 March 2027 </w:t>
+        <w:t>15 March 2027 </w:t>
       </w:r>
       <w:r>
         <w:rPr>
@@ -3752,7 +3752,7 @@
           <w:sz w:val="25"/>
           <w:szCs w:val="25"/>
         </w:rPr>
-        <w:t>FLORENCE TRUJILLO</w:t>
+        <w:t>MELISSA PIERCE</w:t>
       </w:r>
       <w:r>
         <w:rPr>
@@ -8711,7 +8711,7 @@
           <w:szCs w:val="25"/>
           <w:lang w:val="en-US"/>
         </w:rPr>
-        <w:t>05 March 2025</w:t>
+        <w:t>15 March 2025</w:t>
       </w:r>
     </w:p>
     <w:p>
@@ -8836,7 +8836,7 @@
           <w:sz w:val="24"/>
           <w:szCs w:val="24"/>
         </w:rPr>
-        <w:t>FAULKNER HANSON PLC ,</w:t>
+        <w:t>MIDDLETON SANDOVAL PLC ,</w:t>
       </w:r>
       <w:r>
         <w:rPr>
@@ -8854,7 +8854,7 @@
           <w:sz w:val="24"/>
           <w:szCs w:val="24"/>
         </w:rPr>
-        <w:t>FLORENCE TRUJILLO</w:t>
+        <w:t>MELISSA PIERCE</w:t>
       </w:r>
       <w:r>
         <w:rPr>
@@ -8927,7 +8927,7 @@
           <w:szCs w:val="25"/>
           <w:lang w:val="en-US"/>
         </w:rPr>
-        <w:t>MARVIN BRIGHT</w:t>
+        <w:t>XANTHA MARSH</w:t>
       </w:r>
     </w:p>
     <w:p>
@@ -8967,7 +8967,7 @@
           <w:szCs w:val="25"/>
           <w:lang w:val="en-US"/>
         </w:rPr>
-        <w:t>AD COMMODO EU QUIA D</w:t>
+        <w:t>QUI NOSTRUD SINT LI</w:t>
       </w:r>
     </w:p>
     <w:p>

</xml_diff>